<commit_message>
Handover: merge the un-enumerated scan sources into the next quarterly scan
Item 9 now covers the December scan, with a 6 July window start for the sources the
2 September scan never reached, and records that search-filter failures were tool-specific
(test before relying on them). Later items renumbered.

Co-Authored-By: Claude Opus 5.5 <noreply@anthropic.com>
Claude-Session: https://claude.ai/code/session_01AXpUr5Jv7F4hv6YdhfHEwx
</commit_message>
<xml_diff>
--- a/Exports/docx/PROJECT_HANDOVER_Nature_Climate_Indicators.docx
+++ b/Exports/docx/PROJECT_HANDOVER_Nature_Climate_Indicators.docx
@@ -6463,11 +6463,21 @@
         <w:rPr>
           <w:b/>
         </w:rPr>
-        <w:t>The 2 September scan remains partly un-enumerated</w:t>
-      </w:r>
-      <w:r>
-        <w:rPr/>
-        <w:t xml:space="preserve"> (</w:t>
+        <w:t>Next quarterly scan — due around early December 2026.</w:t>
+      </w:r>
+      <w:r>
+        <w:rPr/>
+        <w:t xml:space="preserve"> Its window starts on 2 September, the date of the last scan note, </w:t>
+      </w:r>
+      <w:r>
+        <w:rPr>
+          <w:b/>
+        </w:rPr>
+        <w:t>except for the sources the 2 September scan never covered</w:t>
+      </w:r>
+      <w:r>
+        <w:rPr/>
+        <w:t>, which start from that scan's own window opening, 6 July, so nothing is missed: gov.wales, DAERA, NatureScot, SEPA, NRW; the international bodies (CBD, IPBES, Ramsar, CMS, OSPAR, HELCOM, UNFCCC, EUR-Lex, EEA); UK statutory instruments; the Block 3 title sweep of operational items; forestresearch.gov.uk; 30by30 at sea. Already covered for 6 July – 2 September: ministerial statements, Defra, NE/EA/FC/MMO, JNCC, the record-bearing types for UKHSA/DESNZ/MHCLG/DfT/HMT, UK Public General Acts 2026, CCC, OEP; gov.scot via pointer pages only (</w:t>
       </w:r>
       <w:r>
         <w:rPr>
@@ -6477,17 +6487,17 @@
       </w:r>
       <w:r>
         <w:rPr/>
-        <w:t xml:space="preserve">, final tables). Done: ministerial statements, Defra, NE/EA/FC/MMO, JNCC, the record-bearing types for UKHSA/DESNZ/MHCLG/DfT/HMT, UK Public General Acts 2026, CCC, OEP; gov.scot via pointer pages only. </w:t>
+        <w:t xml:space="preserve">, final tables). </w:t>
       </w:r>
       <w:r>
         <w:rPr>
           <w:b/>
         </w:rPr>
-        <w:t>Not done:</w:t>
-      </w:r>
-      <w:r>
-        <w:rPr/>
-        <w:t xml:space="preserve"> gov.wales, DAERA, NatureScot, SEPA, NRW; the international bodies (CBD, IPBES, Ramsar, CMS, OSPAR, HELCOM, UNFCCC, EUR-Lex, EEA); UK statutory instruments; the Block 3 title sweep (~700 items); forestresearch.gov.uk; 30by30 at sea. The gov.uk and gov.scot search filters are ignored when called from this environment and return the whole corpus — use </w:t>
+        <w:t>Test the search filters before relying on them</w:t>
+      </w:r>
+      <w:r>
+        <w:rPr/>
+        <w:t xml:space="preserve"> (scan protocol §2.0). In September the gov.uk date/organisation filters were lost when called through the fetch tool, which dropped the query string and returned the whole corpus — a plausible-looking false result — but worked through a browser. gov.scot's publication search ignored its URL parameters by either route, so gov.scot is enumerated through its policy pointer pages. GitHub Copilot on Met Office systems may behave differently again: check that a filtered query returns a filtered result before counting a source as enumerated; </w:t>
       </w:r>
       <w:r>
         <w:rPr>
@@ -6497,7 +6507,7 @@
       </w:r>
       <w:r>
         <w:rPr/>
-        <w:t xml:space="preserve"> feeds and pointer pages.</w:t>
+        <w:t xml:space="preserve"> feeds and pointer pages are the fallback.</w:t>
       </w:r>
     </w:p>
     <w:p>
@@ -6517,11 +6527,40 @@
         <w:rPr>
           <w:b/>
         </w:rPr>
-        <w:t>Next quarterly scan</w:t>
-      </w:r>
-      <w:r>
-        <w:rPr/>
-        <w:t xml:space="preserve"> covers 2 September onwards and is due around early December 2026.</w:t>
+        <w:t>Watch items.</w:t>
+      </w:r>
+      <w:r>
+        <w:rPr/>
+        <w:t xml:space="preserve"> JNCC UKBI 2026 ([IFW-03] still records UKBI 2025; usually an autumn release, so likely imminent); the Scottish and Welsh statutory target sets, which both 2026 Acts mandate and which will be </w:t>
+      </w:r>
+      <w:r>
+        <w:rPr>
+          <w:rFonts w:ascii="Consolas" w:hAnsi="Consolas"/>
+        </w:rPr>
+        <w:t>IFW</w:t>
+      </w:r>
+      <w:r>
+        <w:rPr/>
+        <w:t xml:space="preserve"> + </w:t>
+      </w:r>
+      <w:r>
+        <w:rPr>
+          <w:rFonts w:ascii="Consolas" w:hAnsi="Consolas"/>
+        </w:rPr>
+        <w:t>IND</w:t>
+      </w:r>
+      <w:r>
+        <w:rPr/>
+        <w:t xml:space="preserve"> candidates when published.</w:t>
+      </w:r>
+    </w:p>
+    <w:p>
+      <w:pPr>
+        <w:pStyle w:val="Heading3"/>
+      </w:pPr>
+      <w:r>
+        <w:rPr/>
+        <w:t>Content and documentation</w:t>
       </w:r>
     </w:p>
     <w:p>
@@ -6541,40 +6580,51 @@
         <w:rPr>
           <w:b/>
         </w:rPr>
-        <w:t>Watch items.</w:t>
-      </w:r>
-      <w:r>
-        <w:rPr/>
-        <w:t xml:space="preserve"> JNCC UKBI 2026 ([IFW-03] still records UKBI 2025; usually an autumn release, so likely imminent); the Scottish and Welsh statutory target sets, which both 2026 Acts mandate and which will be </w:t>
+        <w:t>Install and test the GitHub Copilot configuration</w:t>
+      </w:r>
+      <w:r>
+        <w:rPr/>
+        <w:t xml:space="preserve"> (§6.1, root </w:t>
       </w:r>
       <w:r>
         <w:rPr>
           <w:rFonts w:ascii="Consolas" w:hAnsi="Consolas"/>
         </w:rPr>
-        <w:t>IFW</w:t>
-      </w:r>
-      <w:r>
-        <w:rPr/>
-        <w:t xml:space="preserve"> + </w:t>
+        <w:t>README.md</w:t>
+      </w:r>
+      <w:r>
+        <w:rPr/>
+        <w:t xml:space="preserve">). Counts, section references and the removed </w:t>
       </w:r>
       <w:r>
         <w:rPr>
           <w:rFonts w:ascii="Consolas" w:hAnsi="Consolas"/>
         </w:rPr>
-        <w:t>IND</w:t>
-      </w:r>
-      <w:r>
-        <w:rPr/>
-        <w:t xml:space="preserve"> candidates when published.</w:t>
-      </w:r>
-    </w:p>
-    <w:p>
-      <w:pPr>
-        <w:pStyle w:val="Heading3"/>
-      </w:pPr>
-      <w:r>
-        <w:rPr/>
-        <w:t>Content and documentation</w:t>
+        <w:t>FRAMEWORK_CTX</w:t>
+      </w:r>
+      <w:r>
+        <w:rPr/>
+        <w:t xml:space="preserve"> were corrected throughout </w:t>
+      </w:r>
+      <w:r>
+        <w:rPr>
+          <w:rFonts w:ascii="Consolas" w:hAnsi="Consolas"/>
+        </w:rPr>
+        <w:t>Copilot_setup/</w:t>
+      </w:r>
+      <w:r>
+        <w:rPr/>
+        <w:t xml:space="preserve"> and the root </w:t>
+      </w:r>
+      <w:r>
+        <w:rPr>
+          <w:rFonts w:ascii="Consolas" w:hAnsi="Consolas"/>
+        </w:rPr>
+        <w:t>README.md</w:t>
+      </w:r>
+      <w:r>
+        <w:rPr/>
+        <w:t xml:space="preserve"> on 6 October 2026, but nothing has yet run in VS Code; the tool-set names and handoff syntax are from documentation only.</w:t>
       </w:r>
     </w:p>
     <w:p>
@@ -6594,51 +6644,21 @@
         <w:rPr>
           <w:b/>
         </w:rPr>
-        <w:t>Install and test the GitHub Copilot configuration</w:t>
-      </w:r>
-      <w:r>
-        <w:rPr/>
-        <w:t xml:space="preserve"> (§6.1, root </w:t>
+        <w:t>Scale the MO research→policy relevance rubric</w:t>
+      </w:r>
+      <w:r>
+        <w:rPr/>
+        <w:t xml:space="preserve"> from 5 piloted entries to the remaining ~41 policy records. Three design questions block it: the scope of </w:t>
       </w:r>
       <w:r>
         <w:rPr>
           <w:rFonts w:ascii="Consolas" w:hAnsi="Consolas"/>
         </w:rPr>
-        <w:t>README.md</w:t>
-      </w:r>
-      <w:r>
-        <w:rPr/>
-        <w:t xml:space="preserve">). Counts, section references and the removed </w:t>
-      </w:r>
-      <w:r>
-        <w:rPr>
-          <w:rFonts w:ascii="Consolas" w:hAnsi="Consolas"/>
-        </w:rPr>
-        <w:t>FRAMEWORK_CTX</w:t>
-      </w:r>
-      <w:r>
-        <w:rPr/>
-        <w:t xml:space="preserve"> were corrected throughout </w:t>
-      </w:r>
-      <w:r>
-        <w:rPr>
-          <w:rFonts w:ascii="Consolas" w:hAnsi="Consolas"/>
-        </w:rPr>
-        <w:t>Copilot_setup/</w:t>
-      </w:r>
-      <w:r>
-        <w:rPr/>
-        <w:t xml:space="preserve"> and the root </w:t>
-      </w:r>
-      <w:r>
-        <w:rPr>
-          <w:rFonts w:ascii="Consolas" w:hAnsi="Consolas"/>
-        </w:rPr>
-        <w:t>README.md</w:t>
-      </w:r>
-      <w:r>
-        <w:rPr/>
-        <w:t xml:space="preserve"> on 6 October 2026, but nothing has yet run in VS Code; the tool-set names and handoff syntax are from documentation only.</w:t>
+        <w:t>Cur_MO</w:t>
+      </w:r>
+      <w:r>
+        <w:rPr/>
+        <w:t>; whether Supplier entries share the main matrix or get a separate tab; the confidence floor below which a score is not reportable.</w:t>
       </w:r>
     </w:p>
     <w:p>
@@ -6658,21 +6678,21 @@
         <w:rPr>
           <w:b/>
         </w:rPr>
-        <w:t>Scale the MO research→policy relevance rubric</w:t>
-      </w:r>
-      <w:r>
-        <w:rPr/>
-        <w:t xml:space="preserve"> from 5 piloted entries to the remaining ~41 policy records. Three design questions block it: the scope of </w:t>
+        <w:t>Dashboard user guide unwritten</w:t>
+      </w:r>
+      <w:r>
+        <w:rPr/>
+        <w:t xml:space="preserve"> — what each dashboard shows, data vintage, search, deep-link and export. The in-page Help modals partly cover it. (The canonical-files guide is written: </w:t>
       </w:r>
       <w:r>
         <w:rPr>
           <w:rFonts w:ascii="Consolas" w:hAnsi="Consolas"/>
         </w:rPr>
-        <w:t>Cur_MO</w:t>
-      </w:r>
-      <w:r>
-        <w:rPr/>
-        <w:t>; whether Supplier entries share the main matrix or get a separate tab; the confidence floor below which a score is not reportable.</w:t>
+        <w:t>Data/CANONICAL_FILES_GUIDE.md</w:t>
+      </w:r>
+      <w:r>
+        <w:rPr/>
+        <w:t>.)</w:t>
       </w:r>
     </w:p>
     <w:p>
@@ -6692,21 +6712,41 @@
         <w:rPr>
           <w:b/>
         </w:rPr>
-        <w:t>Dashboard user guide unwritten</w:t>
-      </w:r>
-      <w:r>
-        <w:rPr/>
-        <w:t xml:space="preserve"> — what each dashboard shows, data vintage, search, deep-link and export. The in-page Help modals partly cover it. (The canonical-files guide is written: </w:t>
+        <w:t>Add the two missing completed configs</w:t>
+      </w:r>
+      <w:r>
+        <w:rPr/>
+        <w:t xml:space="preserve"> (biosecurity, LST) to </w:t>
       </w:r>
       <w:r>
         <w:rPr>
           <w:rFonts w:ascii="Consolas" w:hAnsi="Consolas"/>
         </w:rPr>
-        <w:t>Data/CANONICAL_FILES_GUIDE.md</w:t>
-      </w:r>
-      <w:r>
-        <w:rPr/>
-        <w:t>.)</w:t>
+        <w:t>PA_toolkit/completed_assessments/</w:t>
+      </w:r>
+      <w:r>
+        <w:rPr/>
+        <w:t xml:space="preserve"> so all four rendered assessments are reproducible from source. Only </w:t>
+      </w:r>
+      <w:r>
+        <w:rPr>
+          <w:rFonts w:ascii="Consolas" w:hAnsi="Consolas"/>
+        </w:rPr>
+        <w:t>config_dailysun.yaml</w:t>
+      </w:r>
+      <w:r>
+        <w:rPr/>
+        <w:t xml:space="preserve"> and </w:t>
+      </w:r>
+      <w:r>
+        <w:rPr>
+          <w:rFonts w:ascii="Consolas" w:hAnsi="Consolas"/>
+        </w:rPr>
+        <w:t>config_ocean_heatwaves.yaml</w:t>
+      </w:r>
+      <w:r>
+        <w:rPr/>
+        <w:t xml:space="preserve"> exist.</w:t>
       </w:r>
     </w:p>
     <w:p>
@@ -6726,41 +6766,30 @@
         <w:rPr>
           <w:b/>
         </w:rPr>
-        <w:t>Add the two missing completed configs</w:t>
-      </w:r>
-      <w:r>
-        <w:rPr/>
-        <w:t xml:space="preserve"> (biosecurity, LST) to </w:t>
+        <w:t>CHECK-row judgement calls</w:t>
+      </w:r>
+      <w:r>
+        <w:rPr/>
+        <w:t xml:space="preserve"> left from the orphan-code promotion (</w:t>
       </w:r>
       <w:r>
         <w:rPr>
           <w:rFonts w:ascii="Consolas" w:hAnsi="Consolas"/>
         </w:rPr>
-        <w:t>PA_toolkit/completed_assessments/</w:t>
-      </w:r>
-      <w:r>
-        <w:rPr/>
-        <w:t xml:space="preserve"> so all four rendered assessments are reproducible from source. Only </w:t>
-      </w:r>
-      <w:r>
-        <w:rPr>
-          <w:rFonts w:ascii="Consolas" w:hAnsi="Consolas"/>
-        </w:rPr>
-        <w:t>config_dailysun.yaml</w:t>
-      </w:r>
-      <w:r>
-        <w:rPr/>
-        <w:t xml:space="preserve"> and </w:t>
-      </w:r>
-      <w:r>
-        <w:rPr>
-          <w:rFonts w:ascii="Consolas" w:hAnsi="Consolas"/>
-        </w:rPr>
-        <w:t>config_ocean_heatwaves.yaml</w:t>
-      </w:r>
-      <w:r>
-        <w:rPr/>
-        <w:t xml:space="preserve"> exist.</w:t>
+        <w:t>outputs_other/ORPHAN_CODES_promotion_analysis.md</w:t>
+      </w:r>
+      <w:r>
+        <w:rPr/>
+        <w:t>).</w:t>
+      </w:r>
+    </w:p>
+    <w:p>
+      <w:pPr>
+        <w:pStyle w:val="Heading3"/>
+      </w:pPr>
+      <w:r>
+        <w:rPr/>
+        <w:t>Housekeeping</w:t>
       </w:r>
     </w:p>
     <w:p>
@@ -6778,32 +6807,80 @@
       </w:r>
       <w:r>
         <w:rPr>
+          <w:rFonts w:ascii="Consolas" w:hAnsi="Consolas"/>
           <w:b/>
         </w:rPr>
-        <w:t>CHECK-row judgement calls</w:t>
-      </w:r>
-      <w:r>
-        <w:rPr/>
-        <w:t xml:space="preserve"> left from the orphan-code promotion (</w:t>
+        <w:t>pending_additions.md</w:t>
+      </w:r>
+      <w:r>
+        <w:rPr>
+          <w:b/>
+        </w:rPr>
+        <w:t xml:space="preserve"> status vocabulary — fixed 6 October 2026.</w:t>
+      </w:r>
+      <w:r>
+        <w:rPr/>
+        <w:t xml:space="preserve"> </w:t>
       </w:r>
       <w:r>
         <w:rPr>
           <w:rFonts w:ascii="Consolas" w:hAnsi="Consolas"/>
         </w:rPr>
-        <w:t>outputs_other/ORPHAN_CODES_promotion_analysis.md</w:t>
-      </w:r>
-      <w:r>
-        <w:rPr/>
-        <w:t>).</w:t>
-      </w:r>
-    </w:p>
-    <w:p>
-      <w:pPr>
-        <w:pStyle w:val="Heading3"/>
-      </w:pPr>
-      <w:r>
-        <w:rPr/>
-        <w:t>Housekeeping</w:t>
+        <w:t>add</w:t>
+      </w:r>
+      <w:r>
+        <w:rPr/>
+        <w:t xml:space="preserve">, </w:t>
+      </w:r>
+      <w:r>
+        <w:rPr>
+          <w:rFonts w:ascii="Consolas" w:hAnsi="Consolas"/>
+        </w:rPr>
+        <w:t>defer</w:t>
+      </w:r>
+      <w:r>
+        <w:rPr/>
+        <w:t xml:space="preserve">, </w:t>
+      </w:r>
+      <w:r>
+        <w:rPr>
+          <w:rFonts w:ascii="Consolas" w:hAnsi="Consolas"/>
+        </w:rPr>
+        <w:t>investigate</w:t>
+      </w:r>
+      <w:r>
+        <w:rPr/>
+        <w:t xml:space="preserve"> and </w:t>
+      </w:r>
+      <w:r>
+        <w:rPr>
+          <w:rFonts w:ascii="Consolas" w:hAnsi="Consolas"/>
+        </w:rPr>
+        <w:t>done</w:t>
+      </w:r>
+      <w:r>
+        <w:rPr/>
+        <w:t xml:space="preserve"> are now defined in the header, and the rows written or closed before v27 are resolved. Two rows still carry bold-wrapped statuses (</w:t>
+      </w:r>
+      <w:r>
+        <w:rPr>
+          <w:rFonts w:ascii="Consolas" w:hAnsi="Consolas"/>
+        </w:rPr>
+        <w:t>**done**</w:t>
+      </w:r>
+      <w:r>
+        <w:rPr/>
+        <w:t xml:space="preserve">, </w:t>
+      </w:r>
+      <w:r>
+        <w:rPr>
+          <w:rFonts w:ascii="Consolas" w:hAnsi="Consolas"/>
+        </w:rPr>
+        <w:t>**rejected**</w:t>
+      </w:r>
+      <w:r>
+        <w:rPr/>
+        <w:t>) — cosmetic.</w:t>
       </w:r>
     </w:p>
     <w:p>
@@ -6824,77 +6901,30 @@
           <w:rFonts w:ascii="Consolas" w:hAnsi="Consolas"/>
           <w:b/>
         </w:rPr>
-        <w:t>pending_additions.md</w:t>
+        <w:t>governance_diagram_v12.html</w:t>
       </w:r>
       <w:r>
         <w:rPr>
           <w:b/>
         </w:rPr>
-        <w:t xml:space="preserve"> status vocabulary — fixed 6 October 2026.</w:t>
-      </w:r>
-      <w:r>
-        <w:rPr/>
-        <w:t xml:space="preserve"> </w:t>
+        <w:t xml:space="preserve"> is arguably due a </w:t>
       </w:r>
       <w:r>
         <w:rPr>
           <w:rFonts w:ascii="Consolas" w:hAnsi="Consolas"/>
-        </w:rPr>
-        <w:t>add</w:t>
-      </w:r>
-      <w:r>
-        <w:rPr/>
-        <w:t xml:space="preserve">, </w:t>
-      </w:r>
-      <w:r>
-        <w:rPr>
-          <w:rFonts w:ascii="Consolas" w:hAnsi="Consolas"/>
-        </w:rPr>
-        <w:t>defer</w:t>
-      </w:r>
-      <w:r>
-        <w:rPr/>
-        <w:t xml:space="preserve">, </w:t>
-      </w:r>
-      <w:r>
-        <w:rPr>
-          <w:rFonts w:ascii="Consolas" w:hAnsi="Consolas"/>
-        </w:rPr>
-        <w:t>investigate</w:t>
-      </w:r>
-      <w:r>
-        <w:rPr/>
-        <w:t xml:space="preserve"> and </w:t>
-      </w:r>
-      <w:r>
-        <w:rPr>
-          <w:rFonts w:ascii="Consolas" w:hAnsi="Consolas"/>
-        </w:rPr>
-        <w:t>done</w:t>
-      </w:r>
-      <w:r>
-        <w:rPr/>
-        <w:t xml:space="preserve"> are now defined in the header, and the rows written or closed before v27 are resolved. Two rows still carry bold-wrapped statuses (</w:t>
-      </w:r>
-      <w:r>
-        <w:rPr>
-          <w:rFonts w:ascii="Consolas" w:hAnsi="Consolas"/>
-        </w:rPr>
-        <w:t>**done**</w:t>
-      </w:r>
-      <w:r>
-        <w:rPr/>
-        <w:t xml:space="preserve">, </w:t>
-      </w:r>
-      <w:r>
-        <w:rPr>
-          <w:rFonts w:ascii="Consolas" w:hAnsi="Consolas"/>
-        </w:rPr>
-        <w:t>**rejected**</w:t>
-      </w:r>
-      <w:r>
-        <w:rPr/>
-        <w:t>) — cosmetic.</w:t>
+          <w:b/>
+        </w:rPr>
+        <w:t>_vN</w:t>
+      </w:r>
+      <w:r>
+        <w:rPr>
+          <w:b/>
+        </w:rPr>
+        <w:t xml:space="preserve"> bump</w:t>
+      </w:r>
+      <w:r>
+        <w:rPr/>
+        <w:t xml:space="preserve"> — a link type and the detail-panel semantics changed on 17 September, and the data again on 28 September.</w:t>
       </w:r>
     </w:p>
     <w:p>
@@ -6912,33 +6942,56 @@
       </w:r>
       <w:r>
         <w:rPr>
+          <w:b/>
+        </w:rPr>
+        <w:t xml:space="preserve">The governance diagram's detail panel is </w:t>
+      </w:r>
+      <w:r>
+        <w:rPr>
           <w:rFonts w:ascii="Consolas" w:hAnsi="Consolas"/>
           <w:b/>
         </w:rPr>
-        <w:t>governance_diagram_v12.html</w:t>
+        <w:t>clamp(118px, 20vh, 200px)</w:t>
       </w:r>
       <w:r>
         <w:rPr>
           <w:b/>
         </w:rPr>
-        <w:t xml:space="preserve"> is arguably due a </w:t>
+        <w:t xml:space="preserve"> tall.</w:t>
+      </w:r>
+      <w:r>
+        <w:rPr/>
+        <w:t xml:space="preserve"> The longest framework </w:t>
       </w:r>
       <w:r>
         <w:rPr>
           <w:rFonts w:ascii="Consolas" w:hAnsi="Consolas"/>
-          <w:b/>
-        </w:rPr>
-        <w:t>_vN</w:t>
-      </w:r>
-      <w:r>
-        <w:rPr>
-          <w:b/>
-        </w:rPr>
-        <w:t xml:space="preserve"> bump</w:t>
-      </w:r>
-      <w:r>
-        <w:rPr/>
-        <w:t xml:space="preserve"> — a link type and the detail-panel semantics changed on 17 September, and the data again on 28 September.</w:t>
+        </w:rPr>
+        <w:t>Policy_Purpose</w:t>
+      </w:r>
+      <w:r>
+        <w:rPr/>
+        <w:t xml:space="preserve"> now runs to 1,343 characters and scrolls. One CSS line in the </w:t>
+      </w:r>
+      <w:r>
+        <w:rPr>
+          <w:rFonts w:ascii="Consolas" w:hAnsi="Consolas"/>
+        </w:rPr>
+        <w:t>TEMPLATE</w:t>
+      </w:r>
+      <w:r>
+        <w:rPr/>
+        <w:t xml:space="preserve"> string of </w:t>
+      </w:r>
+      <w:r>
+        <w:rPr>
+          <w:rFonts w:ascii="Consolas" w:hAnsi="Consolas"/>
+        </w:rPr>
+        <w:t>build_governance_diagram.py</w:t>
+      </w:r>
+      <w:r>
+        <w:rPr/>
+        <w:t xml:space="preserve"> (not the HTML).</w:t>
       </w:r>
     </w:p>
     <w:p>
@@ -6952,73 +7005,6 @@
       <w:r>
         <w:rPr/>
         <w:t>19.</w:t>
-        <w:tab/>
-      </w:r>
-      <w:r>
-        <w:rPr>
-          <w:b/>
-        </w:rPr>
-        <w:t xml:space="preserve">The governance diagram's detail panel is </w:t>
-      </w:r>
-      <w:r>
-        <w:rPr>
-          <w:rFonts w:ascii="Consolas" w:hAnsi="Consolas"/>
-          <w:b/>
-        </w:rPr>
-        <w:t>clamp(118px, 20vh, 200px)</w:t>
-      </w:r>
-      <w:r>
-        <w:rPr>
-          <w:b/>
-        </w:rPr>
-        <w:t xml:space="preserve"> tall.</w:t>
-      </w:r>
-      <w:r>
-        <w:rPr/>
-        <w:t xml:space="preserve"> The longest framework </w:t>
-      </w:r>
-      <w:r>
-        <w:rPr>
-          <w:rFonts w:ascii="Consolas" w:hAnsi="Consolas"/>
-        </w:rPr>
-        <w:t>Policy_Purpose</w:t>
-      </w:r>
-      <w:r>
-        <w:rPr/>
-        <w:t xml:space="preserve"> now runs to 1,343 characters and scrolls. One CSS line in the </w:t>
-      </w:r>
-      <w:r>
-        <w:rPr>
-          <w:rFonts w:ascii="Consolas" w:hAnsi="Consolas"/>
-        </w:rPr>
-        <w:t>TEMPLATE</w:t>
-      </w:r>
-      <w:r>
-        <w:rPr/>
-        <w:t xml:space="preserve"> string of </w:t>
-      </w:r>
-      <w:r>
-        <w:rPr>
-          <w:rFonts w:ascii="Consolas" w:hAnsi="Consolas"/>
-        </w:rPr>
-        <w:t>build_governance_diagram.py</w:t>
-      </w:r>
-      <w:r>
-        <w:rPr/>
-        <w:t xml:space="preserve"> (not the HTML).</w:t>
-      </w:r>
-    </w:p>
-    <w:p>
-      <w:pPr>
-        <w:tabs>
-          <w:tab w:pos="454" w:val="left"/>
-        </w:tabs>
-        <w:spacing w:after="60"/>
-        <w:ind w:left="454" w:hanging="454"/>
-      </w:pPr>
-      <w:r>
-        <w:rPr/>
-        <w:t>20.</w:t>
         <w:tab/>
       </w:r>
       <w:r>

</xml_diff>

<commit_message>
UK v30–v32: decided edits, Humber 2100+, five framework-currency records; Open work trimmed
- UK v30: drought orders/permits noted on LEG-025 and LEG-023; JNCC Signpost series on ORG-004;
  NPS exclusion recorded on POL-050; LEG-013 Royal Assent date verified (24 Feb 2025).
- UK v31: Humber 2100+ folded into POL-045 FCERM Strategy.
- UK v32: POL-112 CBGDP, POL-113 CCRA4-IA, POL-114 CCC progress reports (series),
  POL-115 NICCAP3, POL-116 Scotland's Climate Change Plan 2026–2040; POL-004 and POL-017
  point to their successors.
- Handover Open work now lists uncompleted tasks only; the scan coverage item merged into the
  next quarterly scan; NI Nature Recovery Strategy moved to watch items.
- Climate heatmap and outstanding-issues references removed; new Data/CANONICAL_FILES_GUIDE.md.
- pending_additions.md rows resolved; status formatting normalised.

Co-Authored-By: Claude Opus 5.5 <noreply@anthropic.com>
Claude-Session: https://claude.ai/code/session_01AXpUr5Jv7F4hv6YdhfHEwx
</commit_message>
<xml_diff>
--- a/Exports/docx/PROJECT_HANDOVER_Nature_Climate_Indicators.docx
+++ b/Exports/docx/PROJECT_HANDOVER_Nature_Climate_Indicators.docx
@@ -29,7 +29,7 @@
       </w:r>
       <w:r>
         <w:rPr/>
-        <w:t xml:space="preserve"> (workbooks UK governance v29, international v18, indicators v27). This document describes what exists, where it is and how to use it. It is not a history: settled decisions are not recorded here, only current state and genuinely unresolved work (§9).</w:t>
+        <w:t xml:space="preserve"> (workbooks UK governance v32, international v18, indicators v27). This document describes what exists, where it is and how to use it. It is not a history: settled decisions are not recorded here, only current state and genuinely unresolved work (§9).</w:t>
       </w:r>
     </w:p>
     <w:p>
@@ -801,7 +801,7 @@
                 <w:b/>
                 <w:sz w:val="18"/>
               </w:rPr>
-              <w:t>v29</w:t>
+              <w:t>v32</w:t>
             </w:r>
             <w:r>
               <w:rPr>
@@ -935,7 +935,7 @@
       </w:r>
       <w:r>
         <w:rPr/>
-        <w:t xml:space="preserve"> and 109 </w:t>
+        <w:t xml:space="preserve"> and 114 </w:t>
       </w:r>
       <w:r>
         <w:rPr>
@@ -945,7 +945,7 @@
       </w:r>
       <w:r>
         <w:rPr/>
-        <w:t xml:space="preserve"> records (highest IDs ORG-049, LEG-071, POL-111; POL-023, POL-024, LEG-008 and LEG-009 retired).</w:t>
+        <w:t xml:space="preserve"> records (highest IDs ORG-049, LEG-071, POL-116; POL-023, POL-024, LEG-008 and LEG-009 retired).</w:t>
       </w:r>
     </w:p>
     <w:p>
@@ -1093,7 +1093,7 @@
         <w:rPr>
           <w:b/>
         </w:rPr>
-        <w:t>1,186</w:t>
+        <w:t>1,191</w:t>
       </w:r>
       <w:r>
         <w:rPr/>
@@ -5866,7 +5866,27 @@
     <w:p>
       <w:r>
         <w:rPr/>
-        <w:t>Item status checked against the workbooks, the queue and the file store on 6 October 2026.</w:t>
+        <w:t xml:space="preserve">Uncompleted work only — completed items are removed, and their record is the workbook </w:t>
+      </w:r>
+      <w:r>
+        <w:rPr>
+          <w:rFonts w:ascii="Consolas" w:hAnsi="Consolas"/>
+        </w:rPr>
+        <w:t>Changelog</w:t>
+      </w:r>
+      <w:r>
+        <w:rPr/>
+        <w:t xml:space="preserve">, the queue's </w:t>
+      </w:r>
+      <w:r>
+        <w:rPr>
+          <w:rFonts w:ascii="Consolas" w:hAnsi="Consolas"/>
+        </w:rPr>
+        <w:t>Resolution</w:t>
+      </w:r>
+      <w:r>
+        <w:rPr/>
+        <w:t xml:space="preserve"> column and git history. Checked against the workbooks, the queue and the file store on 6 October 2026.</w:t>
       </w:r>
     </w:p>
     <w:p>
@@ -5875,7 +5895,7 @@
       </w:pPr>
       <w:r>
         <w:rPr/>
-        <w:t>Approved records not yet written — the main backlog</w:t>
+        <w:t>Queue and record backlog</w:t>
       </w:r>
     </w:p>
     <w:p>
@@ -5895,216 +5915,31 @@
         <w:rPr>
           <w:b/>
         </w:rPr>
-        <w:t>Approved queue rows — written in UK governance v27 (6 October 2026).</w:t>
-      </w:r>
-      <w:r>
-        <w:rPr/>
-        <w:t xml:space="preserve"> 4 </w:t>
+        <w:t>D8 legislative backlog audit — approved, not yet run</w:t>
+      </w:r>
+      <w:r>
+        <w:rPr/>
+        <w:t xml:space="preserve"> (</w:t>
       </w:r>
       <w:r>
         <w:rPr>
           <w:rFonts w:ascii="Consolas" w:hAnsi="Consolas"/>
         </w:rPr>
-        <w:t>LEG</w:t>
-      </w:r>
-      <w:r>
-        <w:rPr/>
-        <w:t xml:space="preserve">, 5 </w:t>
+        <w:t>Data/pending_additions.md</w:t>
+      </w:r>
+      <w:r>
+        <w:rPr/>
+        <w:t xml:space="preserve">, Status </w:t>
       </w:r>
       <w:r>
         <w:rPr>
           <w:rFonts w:ascii="Consolas" w:hAnsi="Consolas"/>
         </w:rPr>
-        <w:t>ORG</w:t>
-      </w:r>
-      <w:r>
-        <w:rPr/>
-        <w:t xml:space="preserve"> (incl. [ORG-049] DHSC, added as UKHSA's sponsor) and 39 </w:t>
-      </w:r>
-      <w:r>
-        <w:rPr>
-          <w:rFonts w:ascii="Consolas" w:hAnsi="Consolas"/>
-        </w:rPr>
-        <w:t>POL</w:t>
-      </w:r>
-      <w:r>
-        <w:rPr/>
-        <w:t xml:space="preserve"> ([POL-072]–[POL-110], incl. the 13 Environment Act target delivery plans and overview); "Operational service / System" added to the </w:t>
-      </w:r>
-      <w:r>
-        <w:rPr>
-          <w:rFonts w:ascii="Consolas" w:hAnsi="Consolas"/>
-        </w:rPr>
-        <w:t>Policies &amp; Activities</w:t>
-      </w:r>
-      <w:r>
-        <w:rPr/>
-        <w:t xml:space="preserve"> </w:t>
-      </w:r>
-      <w:r>
-        <w:rPr>
-          <w:rFonts w:ascii="Consolas" w:hAnsi="Consolas"/>
-        </w:rPr>
-        <w:t>General_Type</w:t>
-      </w:r>
-      <w:r>
-        <w:rPr/>
-        <w:t xml:space="preserve"> vocabulary; [LEG-034] corrected (see item 1a). Proposal, verification record and writer script: </w:t>
-      </w:r>
-      <w:r>
-        <w:rPr>
-          <w:rFonts w:ascii="Consolas" w:hAnsi="Consolas"/>
-        </w:rPr>
-        <w:t>outputs_other/workbook_proposal_2026-10-06/</w:t>
-      </w:r>
-      <w:r>
-        <w:rPr/>
-        <w:t xml:space="preserve">. The queue rows are resolved. </w:t>
-      </w:r>
-      <w:r>
-        <w:rPr>
-          <w:b/>
-        </w:rPr>
-        <w:t xml:space="preserve">Still </w:t>
-      </w:r>
-      <w:r>
-        <w:rPr>
-          <w:rFonts w:ascii="Consolas" w:hAnsi="Consolas"/>
-          <w:b/>
-        </w:rPr>
         <w:t>add</w:t>
       </w:r>
       <w:r>
-        <w:rPr>
-          <w:b/>
-        </w:rPr>
-        <w:t>:</w:t>
-      </w:r>
-      <w:r>
-        <w:rPr/>
-        <w:t xml:space="preserve"> the NI Nature Recovery Strategy (draft; write when adopted) and three legislative rows held for the </w:t>
-      </w:r>
-      <w:r>
-        <w:rPr>
-          <w:b/>
-        </w:rPr>
-        <w:t>D8 legislative backlog audit</w:t>
-      </w:r>
-      <w:r>
-        <w:rPr/>
-        <w:t xml:space="preserve"> (Taxation (Energy and Vehicles) Act 2026, Finance Act 2026, English Devolution and Community Empowerment Act 2026, and the 2024–2026 primary-legislation sweep) — not yet run.</w:t>
-      </w:r>
-    </w:p>
-    <w:p>
-      <w:pPr>
-        <w:spacing w:before="0"/>
-        <w:ind w:left="454"/>
-      </w:pPr>
-      <w:r>
-        <w:rPr>
-          <w:b/>
-        </w:rPr>
-        <w:t>Conditions on rejected/investigate rows, not yet honoured:</w:t>
-      </w:r>
-      <w:r>
-        <w:rPr/>
-        <w:t xml:space="preserve"> note drought orders in [LEG-025] and [LEG-023]; add the JNCC Signpost Series as a mention on [ORG-004]; consider folding Humber 2100+ into [POL-045]; record the National Policy Statement exclusion in [POL-050]. (The TE2100 reasoning is in [POL-100].)</w:t>
-      </w:r>
-    </w:p>
-    <w:p>
-      <w:r>
-        <w:rPr/>
-        <w:t xml:space="preserve">1a. </w:t>
-      </w:r>
-      <w:r>
-        <w:rPr>
-          <w:b/>
-        </w:rPr>
-        <w:t>Legislation link audit — done 6 October 2026</w:t>
-      </w:r>
-      <w:r>
-        <w:rPr/>
-        <w:t xml:space="preserve"> (</w:t>
-      </w:r>
-      <w:r>
-        <w:rPr>
-          <w:rFonts w:ascii="Consolas" w:hAnsi="Consolas"/>
-        </w:rPr>
-        <w:t>outputs_other/legislation_link_audit_2026-10-06.md</w:t>
-      </w:r>
-      <w:r>
-        <w:rPr/>
-        <w:t>). Four records linked to a different instrument; all corrected ([LEG-034] in v27; [LEG-013], [LEG-040] repurposed to the Clean Air (Northern Ireland) Order 1981, and [LEG-047] in v28). The check now runs in the release gate (</w:t>
-      </w:r>
-      <w:r>
-        <w:rPr>
-          <w:rFonts w:ascii="Consolas" w:hAnsi="Consolas"/>
-        </w:rPr>
-        <w:t>check_legislation_links.py</w:t>
-      </w:r>
-      <w:r>
-        <w:rPr/>
-        <w:t xml:space="preserve">, §6). </w:t>
-      </w:r>
-      <w:r>
-        <w:rPr>
-          <w:b/>
-        </w:rPr>
-        <w:t>Still open:</w:t>
-      </w:r>
-      <w:r>
-        <w:rPr/>
-        <w:t xml:space="preserve"> [LEG-044] Plant Health (England) Order 2015 is </w:t>
-      </w:r>
-      <w:r>
-        <w:rPr>
-          <w:b/>
-        </w:rPr>
-        <w:t>revoked</w:t>
-      </w:r>
-      <w:r>
-        <w:rPr/>
-        <w:t xml:space="preserve"> — identify the current GB plant-health regime before changing the record (inbound from ORG-020, POL-033, POL-034, POL-052, INT-L-023; the </w:t>
-      </w:r>
-      <w:r>
-        <w:rPr>
-          <w:rFonts w:ascii="Consolas" w:hAnsi="Consolas"/>
-        </w:rPr>
-        <w:t>Status</w:t>
-      </w:r>
-      <w:r>
-        <w:rPr/>
-        <w:t xml:space="preserve"> vocabulary has no "Revoked" stem); [LEG-013] </w:t>
-      </w:r>
-      <w:r>
-        <w:rPr>
-          <w:rFonts w:ascii="Consolas" w:hAnsi="Consolas"/>
-        </w:rPr>
-        <w:t>Status</w:t>
-      </w:r>
-      <w:r>
-        <w:rPr/>
-        <w:t xml:space="preserve"> "Royal Assent Jan 2025" unverified; [LEG-008] BNG retired and [LEG-009] EPPS moved to [POL-111] in v29; LEG-044 is queued as an </w:t>
-      </w:r>
-      <w:r>
-        <w:rPr>
-          <w:rFonts w:ascii="Consolas" w:hAnsi="Consolas"/>
-        </w:rPr>
-        <w:t>investigate</w:t>
-      </w:r>
-      <w:r>
-        <w:rPr/>
-        <w:t xml:space="preserve"> row in </w:t>
-      </w:r>
-      <w:r>
-        <w:rPr>
-          <w:rFonts w:ascii="Consolas" w:hAnsi="Consolas"/>
-        </w:rPr>
-        <w:t>Data/pending_additions.md</w:t>
-      </w:r>
-      <w:r>
-        <w:rPr/>
-        <w:t xml:space="preserve"> (kept unchanged by decision, 6 Oct 2026); [LEG-003], [LEG-049] not yet title-checked (the gate will check them on the first networked run); [LEG-021] links to bills.parliament.uk, which the checker does not read.</w:t>
+        <w:rPr/>
+        <w:t>): Taxation (Energy and Vehicles) Act 2026, Finance Act 2026 (check for CBAM provisions), English Devolution and Community Empowerment Act 2026, and a sweep of 2024–2026 UK primary legislation (only part of it is held), with devolved legislation 2021–2025.</w:t>
       </w:r>
     </w:p>
     <w:p>
@@ -6124,38 +5959,31 @@
         <w:rPr>
           <w:b/>
         </w:rPr>
-        <w:t xml:space="preserve">Five rows still </w:t>
+        <w:t>Legislation records to check:</w:t>
+      </w:r>
+      <w:r>
+        <w:rPr/>
+        <w:t xml:space="preserve"> [LEG-044] Plant Health (England) Order 2015 is marked revoked — identify the current GB plant-health legislation, then decide whether to repurpose or retire the record and whether the </w:t>
       </w:r>
       <w:r>
         <w:rPr>
           <w:rFonts w:ascii="Consolas" w:hAnsi="Consolas"/>
-          <w:b/>
-        </w:rPr>
-        <w:t>pending</w:t>
-      </w:r>
-      <w:r>
-        <w:rPr/>
-        <w:t xml:space="preserve"> from the 17 September framework-currency check: CCRA4-IA </w:t>
-      </w:r>
-      <w:r>
-        <w:rPr>
-          <w:i/>
-        </w:rPr>
-        <w:t>A Well-Adapted UK</w:t>
-      </w:r>
-      <w:r>
-        <w:rPr/>
-        <w:t xml:space="preserve"> (Met Office-led technical report; mark [POL-017] CCRA3 superseded), the Carbon Budget and Growth Delivery Plan (Oct 2025), the CCC 2026 progress report, NICCAP3 and Scotland's Climate Change Plan 2026–2040. </w:t>
-      </w:r>
-      <w:r>
-        <w:rPr>
-          <w:b/>
-        </w:rPr>
-        <w:t>The CBGDP is the most urgent:</w:t>
-      </w:r>
-      <w:r>
-        <w:rPr/>
-        <w:t xml:space="preserve"> the CCC indicator benchmarks were re-derived against it in indicators v18–v20, but the governance workbook still holds only [POL-004] CBDP 2023 (annotated as superseded), so the indicators cite a plan the governance side does not record.</w:t>
+        </w:rPr>
+        <w:t>Status</w:t>
+      </w:r>
+      <w:r>
+        <w:rPr/>
+        <w:t xml:space="preserve"> vocabulary needs a "Revoked" stem (queued as an </w:t>
+      </w:r>
+      <w:r>
+        <w:rPr>
+          <w:rFonts w:ascii="Consolas" w:hAnsi="Consolas"/>
+        </w:rPr>
+        <w:t>investigate</w:t>
+      </w:r>
+      <w:r>
+        <w:rPr/>
+        <w:t xml:space="preserve"> row; inbound from [ORG-020], [POL-033], [POL-034], [POL-052], [INT-L-023]). [LEG-003] and [LEG-049] have not yet been title-checked — the link gate will check them on its first run with network access. [LEG-021] links to bills.parliament.uk, which the gate does not read.</w:t>
       </w:r>
     </w:p>
     <w:p>
@@ -6175,7 +6003,7 @@
         <w:rPr>
           <w:b/>
         </w:rPr>
-        <w:t xml:space="preserve">Nine </w:t>
+        <w:t xml:space="preserve">Eight </w:t>
       </w:r>
       <w:r>
         <w:rPr>
@@ -6192,7 +6020,7 @@
       </w:r>
       <w:r>
         <w:rPr/>
-        <w:t xml:space="preserve"> — Land Use Framework 2026 vs [POL-009], SFI26 vs [POL-054], CBGDP vs [POL-004], revised NPPF, Fisheries Act post-legislative assessment, biodiversity gain statements for NSIPs, the Interactive Story Map, JNCC Signpost Series, UKBI 2026 (below). Eight rows are </w:t>
+        <w:t xml:space="preserve"> — Land Use Framework 2026 vs [POL-009], SFI26 vs [POL-054], revised NPPF, Fisheries Act post-legislative assessment, biodiversity gain statements for NSIPs, the Interactive Story Map, JNCC Signpost Series, UKBI 2026 (below). Eight rows are </w:t>
       </w:r>
       <w:r>
         <w:rPr>
@@ -6531,7 +6359,17 @@
       </w:r>
       <w:r>
         <w:rPr/>
-        <w:t xml:space="preserve"> JNCC UKBI 2026 ([IFW-03] still records UKBI 2025; usually an autumn release, so likely imminent); the Scottish and Welsh statutory target sets, which both 2026 Acts mandate and which will be </w:t>
+        <w:t xml:space="preserve"> JNCC UKBI 2026 ([IFW-03] still records UKBI 2025; usually an autumn release, so likely imminent); the Nature Recovery Strategy for Northern Ireland to 2032 (approved for adding, still a draft — write when adopted; queue Status </w:t>
+      </w:r>
+      <w:r>
+        <w:rPr>
+          <w:rFonts w:ascii="Consolas" w:hAnsi="Consolas"/>
+        </w:rPr>
+        <w:t>add</w:t>
+      </w:r>
+      <w:r>
+        <w:rPr/>
+        <w:t xml:space="preserve">); the Scottish and Welsh statutory target sets, which both 2026 Acts mandate and which will be </w:t>
       </w:r>
       <w:r>
         <w:rPr>
@@ -6594,37 +6432,7 @@
       </w:r>
       <w:r>
         <w:rPr/>
-        <w:t xml:space="preserve">). Counts, section references and the removed </w:t>
-      </w:r>
-      <w:r>
-        <w:rPr>
-          <w:rFonts w:ascii="Consolas" w:hAnsi="Consolas"/>
-        </w:rPr>
-        <w:t>FRAMEWORK_CTX</w:t>
-      </w:r>
-      <w:r>
-        <w:rPr/>
-        <w:t xml:space="preserve"> were corrected throughout </w:t>
-      </w:r>
-      <w:r>
-        <w:rPr>
-          <w:rFonts w:ascii="Consolas" w:hAnsi="Consolas"/>
-        </w:rPr>
-        <w:t>Copilot_setup/</w:t>
-      </w:r>
-      <w:r>
-        <w:rPr/>
-        <w:t xml:space="preserve"> and the root </w:t>
-      </w:r>
-      <w:r>
-        <w:rPr>
-          <w:rFonts w:ascii="Consolas" w:hAnsi="Consolas"/>
-        </w:rPr>
-        <w:t>README.md</w:t>
-      </w:r>
-      <w:r>
-        <w:rPr/>
-        <w:t xml:space="preserve"> on 6 October 2026, but nothing has yet run in VS Code; the tool-set names and handoff syntax are from documentation only.</w:t>
+        <w:t>). Nothing has yet run in VS Code; the tool-set names and handoff syntax are from documentation only.</w:t>
       </w:r>
     </w:p>
     <w:p>
@@ -6682,17 +6490,7 @@
       </w:r>
       <w:r>
         <w:rPr/>
-        <w:t xml:space="preserve"> — what each dashboard shows, data vintage, search, deep-link and export. The in-page Help modals partly cover it. (The canonical-files guide is written: </w:t>
-      </w:r>
-      <w:r>
-        <w:rPr>
-          <w:rFonts w:ascii="Consolas" w:hAnsi="Consolas"/>
-        </w:rPr>
-        <w:t>Data/CANONICAL_FILES_GUIDE.md</w:t>
-      </w:r>
-      <w:r>
-        <w:rPr/>
-        <w:t>.)</w:t>
+        <w:t xml:space="preserve"> — what each dashboard shows, data vintage, search, deep-link and export. The in-page Help modals partly cover it.</w:t>
       </w:r>
     </w:p>
     <w:p>
@@ -6810,77 +6608,30 @@
           <w:rFonts w:ascii="Consolas" w:hAnsi="Consolas"/>
           <w:b/>
         </w:rPr>
-        <w:t>pending_additions.md</w:t>
+        <w:t>governance_diagram_v12.html</w:t>
       </w:r>
       <w:r>
         <w:rPr>
           <w:b/>
         </w:rPr>
-        <w:t xml:space="preserve"> status vocabulary — fixed 6 October 2026.</w:t>
-      </w:r>
-      <w:r>
-        <w:rPr/>
-        <w:t xml:space="preserve"> </w:t>
+        <w:t xml:space="preserve"> is arguably due a </w:t>
       </w:r>
       <w:r>
         <w:rPr>
           <w:rFonts w:ascii="Consolas" w:hAnsi="Consolas"/>
-        </w:rPr>
-        <w:t>add</w:t>
-      </w:r>
-      <w:r>
-        <w:rPr/>
-        <w:t xml:space="preserve">, </w:t>
-      </w:r>
-      <w:r>
-        <w:rPr>
-          <w:rFonts w:ascii="Consolas" w:hAnsi="Consolas"/>
-        </w:rPr>
-        <w:t>defer</w:t>
-      </w:r>
-      <w:r>
-        <w:rPr/>
-        <w:t xml:space="preserve">, </w:t>
-      </w:r>
-      <w:r>
-        <w:rPr>
-          <w:rFonts w:ascii="Consolas" w:hAnsi="Consolas"/>
-        </w:rPr>
-        <w:t>investigate</w:t>
-      </w:r>
-      <w:r>
-        <w:rPr/>
-        <w:t xml:space="preserve"> and </w:t>
-      </w:r>
-      <w:r>
-        <w:rPr>
-          <w:rFonts w:ascii="Consolas" w:hAnsi="Consolas"/>
-        </w:rPr>
-        <w:t>done</w:t>
-      </w:r>
-      <w:r>
-        <w:rPr/>
-        <w:t xml:space="preserve"> are now defined in the header, and the rows written or closed before v27 are resolved. Two rows still carry bold-wrapped statuses (</w:t>
-      </w:r>
-      <w:r>
-        <w:rPr>
-          <w:rFonts w:ascii="Consolas" w:hAnsi="Consolas"/>
-        </w:rPr>
-        <w:t>**done**</w:t>
-      </w:r>
-      <w:r>
-        <w:rPr/>
-        <w:t xml:space="preserve">, </w:t>
-      </w:r>
-      <w:r>
-        <w:rPr>
-          <w:rFonts w:ascii="Consolas" w:hAnsi="Consolas"/>
-        </w:rPr>
-        <w:t>**rejected**</w:t>
-      </w:r>
-      <w:r>
-        <w:rPr/>
-        <w:t>) — cosmetic.</w:t>
+          <w:b/>
+        </w:rPr>
+        <w:t>_vN</w:t>
+      </w:r>
+      <w:r>
+        <w:rPr>
+          <w:b/>
+        </w:rPr>
+        <w:t xml:space="preserve"> bump</w:t>
+      </w:r>
+      <w:r>
+        <w:rPr/>
+        <w:t xml:space="preserve"> — a link type and the detail-panel semantics changed on 17 September, and the data again on 28 September.</w:t>
       </w:r>
     </w:p>
     <w:p>
@@ -6898,33 +6649,56 @@
       </w:r>
       <w:r>
         <w:rPr>
+          <w:b/>
+        </w:rPr>
+        <w:t xml:space="preserve">The governance diagram's detail panel is </w:t>
+      </w:r>
+      <w:r>
+        <w:rPr>
           <w:rFonts w:ascii="Consolas" w:hAnsi="Consolas"/>
           <w:b/>
         </w:rPr>
-        <w:t>governance_diagram_v12.html</w:t>
+        <w:t>clamp(118px, 20vh, 200px)</w:t>
       </w:r>
       <w:r>
         <w:rPr>
           <w:b/>
         </w:rPr>
-        <w:t xml:space="preserve"> is arguably due a </w:t>
+        <w:t xml:space="preserve"> tall.</w:t>
+      </w:r>
+      <w:r>
+        <w:rPr/>
+        <w:t xml:space="preserve"> The longest framework </w:t>
       </w:r>
       <w:r>
         <w:rPr>
           <w:rFonts w:ascii="Consolas" w:hAnsi="Consolas"/>
-          <w:b/>
-        </w:rPr>
-        <w:t>_vN</w:t>
-      </w:r>
-      <w:r>
-        <w:rPr>
-          <w:b/>
-        </w:rPr>
-        <w:t xml:space="preserve"> bump</w:t>
-      </w:r>
-      <w:r>
-        <w:rPr/>
-        <w:t xml:space="preserve"> — a link type and the detail-panel semantics changed on 17 September, and the data again on 28 September.</w:t>
+        </w:rPr>
+        <w:t>Policy_Purpose</w:t>
+      </w:r>
+      <w:r>
+        <w:rPr/>
+        <w:t xml:space="preserve"> now runs to 1,343 characters and scrolls. One CSS line in the </w:t>
+      </w:r>
+      <w:r>
+        <w:rPr>
+          <w:rFonts w:ascii="Consolas" w:hAnsi="Consolas"/>
+        </w:rPr>
+        <w:t>TEMPLATE</w:t>
+      </w:r>
+      <w:r>
+        <w:rPr/>
+        <w:t xml:space="preserve"> string of </w:t>
+      </w:r>
+      <w:r>
+        <w:rPr>
+          <w:rFonts w:ascii="Consolas" w:hAnsi="Consolas"/>
+        </w:rPr>
+        <w:t>build_governance_diagram.py</w:t>
+      </w:r>
+      <w:r>
+        <w:rPr/>
+        <w:t xml:space="preserve"> (not the HTML).</w:t>
       </w:r>
     </w:p>
     <w:p>
@@ -6938,73 +6712,6 @@
       <w:r>
         <w:rPr/>
         <w:t>18.</w:t>
-        <w:tab/>
-      </w:r>
-      <w:r>
-        <w:rPr>
-          <w:b/>
-        </w:rPr>
-        <w:t xml:space="preserve">The governance diagram's detail panel is </w:t>
-      </w:r>
-      <w:r>
-        <w:rPr>
-          <w:rFonts w:ascii="Consolas" w:hAnsi="Consolas"/>
-          <w:b/>
-        </w:rPr>
-        <w:t>clamp(118px, 20vh, 200px)</w:t>
-      </w:r>
-      <w:r>
-        <w:rPr>
-          <w:b/>
-        </w:rPr>
-        <w:t xml:space="preserve"> tall.</w:t>
-      </w:r>
-      <w:r>
-        <w:rPr/>
-        <w:t xml:space="preserve"> The longest framework </w:t>
-      </w:r>
-      <w:r>
-        <w:rPr>
-          <w:rFonts w:ascii="Consolas" w:hAnsi="Consolas"/>
-        </w:rPr>
-        <w:t>Policy_Purpose</w:t>
-      </w:r>
-      <w:r>
-        <w:rPr/>
-        <w:t xml:space="preserve"> now runs to 1,343 characters and scrolls. One CSS line in the </w:t>
-      </w:r>
-      <w:r>
-        <w:rPr>
-          <w:rFonts w:ascii="Consolas" w:hAnsi="Consolas"/>
-        </w:rPr>
-        <w:t>TEMPLATE</w:t>
-      </w:r>
-      <w:r>
-        <w:rPr/>
-        <w:t xml:space="preserve"> string of </w:t>
-      </w:r>
-      <w:r>
-        <w:rPr>
-          <w:rFonts w:ascii="Consolas" w:hAnsi="Consolas"/>
-        </w:rPr>
-        <w:t>build_governance_diagram.py</w:t>
-      </w:r>
-      <w:r>
-        <w:rPr/>
-        <w:t xml:space="preserve"> (not the HTML).</w:t>
-      </w:r>
-    </w:p>
-    <w:p>
-      <w:pPr>
-        <w:tabs>
-          <w:tab w:pos="454" w:val="left"/>
-        </w:tabs>
-        <w:spacing w:after="60"/>
-        <w:ind w:left="454" w:hanging="454"/>
-      </w:pPr>
-      <w:r>
-        <w:rPr/>
-        <w:t>19.</w:t>
         <w:tab/>
       </w:r>
       <w:r>
@@ -7284,7 +6991,7 @@
       </w:r>
       <w:r>
         <w:rPr/>
-        <w:t xml:space="preserve"> row listed in §9 item 1; the "Operational service / System" term missing from the Data Dictionary; which completed configs exist; stale counts in the root README and the GitHub Copilot configuration (corrected 6 October; §6.1).</w:t>
+        <w:t xml:space="preserve"> row approved on 10–11 September; the "Operational service / System" term missing from the Data Dictionary; which completed configs exist; stale counts in the root README and the GitHub Copilot configuration (corrected 6 October; §6.1).</w:t>
       </w:r>
     </w:p>
     <w:p>

</xml_diff>

<commit_message>
Dashboard user guide; dashboards rebuilt; handover updated
- New Dashboards/DASHBOARD_USER_GUIDE.md: both dashboards, data currency, climate score,
  policy context, export, diagram links and controls; exported to Word with the other guides.
- Dashboards rebuilt from indicators v28 / UK v33 / international v18.
- Handover: guide added to the layout, framework-sheet onboarding note, IND-M family,
  MCCIP score distribution; Open work item for the guide removed.

Co-Authored-By: Claude Opus 5.5 <noreply@anthropic.com>
Claude-Session: https://claude.ai/code/session_01AXpUr5Jv7F4hv6YdhfHEwx
</commit_message>
<xml_diff>
--- a/Exports/docx/PROJECT_HANDOVER_Nature_Climate_Indicators.docx
+++ b/Exports/docx/PROJECT_HANDOVER_Nature_Climate_Indicators.docx
@@ -376,7 +376,20 @@
               <w:rPr>
                 <w:sz w:val="18"/>
               </w:rPr>
-              <w:t xml:space="preserve">The two generated HTML dashboards; </w:t>
+              <w:t xml:space="preserve">The two generated HTML dashboards, </w:t>
+            </w:r>
+            <w:r>
+              <w:rPr>
+                <w:rFonts w:ascii="Consolas" w:hAnsi="Consolas"/>
+                <w:sz w:val="18"/>
+              </w:rPr>
+              <w:t>DASHBOARD_USER_GUIDE.md</w:t>
+            </w:r>
+            <w:r>
+              <w:rPr>
+                <w:sz w:val="18"/>
+              </w:rPr>
+              <w:t xml:space="preserve"> (how to use them), and </w:t>
             </w:r>
             <w:r>
               <w:rPr>
@@ -389,7 +402,7 @@
               <w:rPr>
                 <w:sz w:val="18"/>
               </w:rPr>
-              <w:t xml:space="preserve"> holds their build scripts.</w:t>
+              <w:t xml:space="preserve"> holding their build scripts.</w:t>
             </w:r>
           </w:p>
         </w:tc>
@@ -1463,7 +1476,7 @@
       </w:r>
       <w:r>
         <w:rPr/>
-        <w:t xml:space="preserve"> instead. Harmonised across all nine sheets in v27 (162 of 985 records changed); distribution 0/1/2/3 = 435/269/201/80. Blank means </w:t>
+        <w:t xml:space="preserve"> instead. Harmonised across all nine sheets in v27 (162 of 985 records changed); distribution 0/1/2/3 = 435/269/201/80 at v27, plus the 16 MCCIP records scored under the same rules in v28 (0/3/3/10). Blank means </w:t>
       </w:r>
       <w:r>
         <w:rPr>
@@ -2529,6 +2542,64 @@
       <w:r>
         <w:rPr/>
         <w:t>, not about the single indicator on screen, and the panel previously never said which framework was meant.</w:t>
+      </w:r>
+    </w:p>
+    <w:p>
+      <w:r>
+        <w:rPr>
+          <w:b/>
+        </w:rPr>
+        <w:t>Adding a framework sheet</w:t>
+      </w:r>
+      <w:r>
+        <w:rPr/>
+        <w:t xml:space="preserve"> needs two code-side edits besides the workbook: an entry in </w:t>
+      </w:r>
+      <w:r>
+        <w:rPr>
+          <w:rFonts w:ascii="Consolas" w:hAnsi="Consolas"/>
+        </w:rPr>
+        <w:t>FRAMEWORKS</w:t>
+      </w:r>
+      <w:r>
+        <w:rPr/>
+        <w:t xml:space="preserve"> at the top of </w:t>
+      </w:r>
+      <w:r>
+        <w:rPr>
+          <w:rFonts w:ascii="Consolas" w:hAnsi="Consolas"/>
+        </w:rPr>
+        <w:t>build_indicator_finder.py</w:t>
+      </w:r>
+      <w:r>
+        <w:rPr/>
+        <w:t xml:space="preserve"> (sheet name, short code, label — sheets not listed are not read) and a filter button in the finder HTML (</w:t>
+      </w:r>
+      <w:r>
+        <w:rPr>
+          <w:rFonts w:ascii="Consolas" w:hAnsi="Consolas"/>
+        </w:rPr>
+        <w:t>setFW('&lt;code&gt;',this)</w:t>
+      </w:r>
+      <w:r>
+        <w:rPr/>
+        <w:t>). Done for MCCIP in v28.</w:t>
+      </w:r>
+    </w:p>
+    <w:p>
+      <w:r>
+        <w:rPr/>
+        <w:t xml:space="preserve">User-facing guide to both dashboards: </w:t>
+      </w:r>
+      <w:r>
+        <w:rPr>
+          <w:rFonts w:ascii="Consolas" w:hAnsi="Consolas"/>
+        </w:rPr>
+        <w:t>Dashboards/DASHBOARD_USER_GUIDE.md</w:t>
+      </w:r>
+      <w:r>
+        <w:rPr/>
+        <w:t>.</w:t>
       </w:r>
     </w:p>
     <w:p>
@@ -5478,7 +5549,17 @@
       </w:r>
       <w:r>
         <w:rPr/>
-        <w:t xml:space="preserve"> EEA, then the frameworks' own codes — </w:t>
+        <w:t xml:space="preserve"> EEA, </w:t>
+      </w:r>
+      <w:r>
+        <w:rPr>
+          <w:rFonts w:ascii="Consolas" w:hAnsi="Consolas"/>
+        </w:rPr>
+        <w:t>IND-M-</w:t>
+      </w:r>
+      <w:r>
+        <w:rPr/>
+        <w:t xml:space="preserve"> MCCIP, then the frameworks' own codes — </w:t>
       </w:r>
       <w:r>
         <w:rPr>
@@ -6432,11 +6513,41 @@
         <w:rPr>
           <w:b/>
         </w:rPr>
-        <w:t>Dashboard user guide unwritten</w:t>
-      </w:r>
-      <w:r>
-        <w:rPr/>
-        <w:t xml:space="preserve"> — what each dashboard shows, data vintage, search, deep-link and export. The in-page Help modals partly cover it.</w:t>
+        <w:t>Add the two missing completed configs</w:t>
+      </w:r>
+      <w:r>
+        <w:rPr/>
+        <w:t xml:space="preserve"> (biosecurity, LST) to </w:t>
+      </w:r>
+      <w:r>
+        <w:rPr>
+          <w:rFonts w:ascii="Consolas" w:hAnsi="Consolas"/>
+        </w:rPr>
+        <w:t>PA_toolkit/completed_assessments/</w:t>
+      </w:r>
+      <w:r>
+        <w:rPr/>
+        <w:t xml:space="preserve"> so all four rendered assessments are reproducible from source. Only </w:t>
+      </w:r>
+      <w:r>
+        <w:rPr>
+          <w:rFonts w:ascii="Consolas" w:hAnsi="Consolas"/>
+        </w:rPr>
+        <w:t>config_dailysun.yaml</w:t>
+      </w:r>
+      <w:r>
+        <w:rPr/>
+        <w:t xml:space="preserve"> and </w:t>
+      </w:r>
+      <w:r>
+        <w:rPr>
+          <w:rFonts w:ascii="Consolas" w:hAnsi="Consolas"/>
+        </w:rPr>
+        <w:t>config_ocean_heatwaves.yaml</w:t>
+      </w:r>
+      <w:r>
+        <w:rPr/>
+        <w:t xml:space="preserve"> exist.</w:t>
       </w:r>
     </w:p>
     <w:p>
@@ -6456,41 +6567,30 @@
         <w:rPr>
           <w:b/>
         </w:rPr>
-        <w:t>Add the two missing completed configs</w:t>
-      </w:r>
-      <w:r>
-        <w:rPr/>
-        <w:t xml:space="preserve"> (biosecurity, LST) to </w:t>
+        <w:t>CHECK-row judgement calls</w:t>
+      </w:r>
+      <w:r>
+        <w:rPr/>
+        <w:t xml:space="preserve"> left from the orphan-code promotion (</w:t>
       </w:r>
       <w:r>
         <w:rPr>
           <w:rFonts w:ascii="Consolas" w:hAnsi="Consolas"/>
         </w:rPr>
-        <w:t>PA_toolkit/completed_assessments/</w:t>
-      </w:r>
-      <w:r>
-        <w:rPr/>
-        <w:t xml:space="preserve"> so all four rendered assessments are reproducible from source. Only </w:t>
-      </w:r>
-      <w:r>
-        <w:rPr>
-          <w:rFonts w:ascii="Consolas" w:hAnsi="Consolas"/>
-        </w:rPr>
-        <w:t>config_dailysun.yaml</w:t>
-      </w:r>
-      <w:r>
-        <w:rPr/>
-        <w:t xml:space="preserve"> and </w:t>
-      </w:r>
-      <w:r>
-        <w:rPr>
-          <w:rFonts w:ascii="Consolas" w:hAnsi="Consolas"/>
-        </w:rPr>
-        <w:t>config_ocean_heatwaves.yaml</w:t>
-      </w:r>
-      <w:r>
-        <w:rPr/>
-        <w:t xml:space="preserve"> exist.</w:t>
+        <w:t>outputs_other/ORPHAN_CODES_promotion_analysis.md</w:t>
+      </w:r>
+      <w:r>
+        <w:rPr/>
+        <w:t>).</w:t>
+      </w:r>
+    </w:p>
+    <w:p>
+      <w:pPr>
+        <w:pStyle w:val="Heading3"/>
+      </w:pPr>
+      <w:r>
+        <w:rPr/>
+        <w:t>Housekeeping</w:t>
       </w:r>
     </w:p>
     <w:p>
@@ -6508,32 +6608,33 @@
       </w:r>
       <w:r>
         <w:rPr>
+          <w:rFonts w:ascii="Consolas" w:hAnsi="Consolas"/>
           <w:b/>
         </w:rPr>
-        <w:t>CHECK-row judgement calls</w:t>
-      </w:r>
-      <w:r>
-        <w:rPr/>
-        <w:t xml:space="preserve"> left from the orphan-code promotion (</w:t>
+        <w:t>governance_diagram_v12.html</w:t>
+      </w:r>
+      <w:r>
+        <w:rPr>
+          <w:b/>
+        </w:rPr>
+        <w:t xml:space="preserve"> is arguably due a </w:t>
       </w:r>
       <w:r>
         <w:rPr>
           <w:rFonts w:ascii="Consolas" w:hAnsi="Consolas"/>
-        </w:rPr>
-        <w:t>outputs_other/ORPHAN_CODES_promotion_analysis.md</w:t>
-      </w:r>
-      <w:r>
-        <w:rPr/>
-        <w:t>).</w:t>
-      </w:r>
-    </w:p>
-    <w:p>
-      <w:pPr>
-        <w:pStyle w:val="Heading3"/>
-      </w:pPr>
-      <w:r>
-        <w:rPr/>
-        <w:t>Housekeeping</w:t>
+          <w:b/>
+        </w:rPr>
+        <w:t>_vN</w:t>
+      </w:r>
+      <w:r>
+        <w:rPr>
+          <w:b/>
+        </w:rPr>
+        <w:t xml:space="preserve"> bump</w:t>
+      </w:r>
+      <w:r>
+        <w:rPr/>
+        <w:t xml:space="preserve"> — a link type and the detail-panel semantics changed on 17 September, and the data again on 28 September.</w:t>
       </w:r>
     </w:p>
     <w:p>
@@ -6551,33 +6652,56 @@
       </w:r>
       <w:r>
         <w:rPr>
+          <w:b/>
+        </w:rPr>
+        <w:t xml:space="preserve">The governance diagram's detail panel is </w:t>
+      </w:r>
+      <w:r>
+        <w:rPr>
           <w:rFonts w:ascii="Consolas" w:hAnsi="Consolas"/>
           <w:b/>
         </w:rPr>
-        <w:t>governance_diagram_v12.html</w:t>
+        <w:t>clamp(118px, 20vh, 200px)</w:t>
       </w:r>
       <w:r>
         <w:rPr>
           <w:b/>
         </w:rPr>
-        <w:t xml:space="preserve"> is arguably due a </w:t>
+        <w:t xml:space="preserve"> tall.</w:t>
+      </w:r>
+      <w:r>
+        <w:rPr/>
+        <w:t xml:space="preserve"> The longest framework </w:t>
       </w:r>
       <w:r>
         <w:rPr>
           <w:rFonts w:ascii="Consolas" w:hAnsi="Consolas"/>
-          <w:b/>
-        </w:rPr>
-        <w:t>_vN</w:t>
-      </w:r>
-      <w:r>
-        <w:rPr>
-          <w:b/>
-        </w:rPr>
-        <w:t xml:space="preserve"> bump</w:t>
-      </w:r>
-      <w:r>
-        <w:rPr/>
-        <w:t xml:space="preserve"> — a link type and the detail-panel semantics changed on 17 September, and the data again on 28 September.</w:t>
+        </w:rPr>
+        <w:t>Policy_Purpose</w:t>
+      </w:r>
+      <w:r>
+        <w:rPr/>
+        <w:t xml:space="preserve"> now runs to 1,343 characters and scrolls. One CSS line in the </w:t>
+      </w:r>
+      <w:r>
+        <w:rPr>
+          <w:rFonts w:ascii="Consolas" w:hAnsi="Consolas"/>
+        </w:rPr>
+        <w:t>TEMPLATE</w:t>
+      </w:r>
+      <w:r>
+        <w:rPr/>
+        <w:t xml:space="preserve"> string of </w:t>
+      </w:r>
+      <w:r>
+        <w:rPr>
+          <w:rFonts w:ascii="Consolas" w:hAnsi="Consolas"/>
+        </w:rPr>
+        <w:t>build_governance_diagram.py</w:t>
+      </w:r>
+      <w:r>
+        <w:rPr/>
+        <w:t xml:space="preserve"> (not the HTML).</w:t>
       </w:r>
     </w:p>
     <w:p>
@@ -6591,73 +6715,6 @@
       <w:r>
         <w:rPr/>
         <w:t>16.</w:t>
-        <w:tab/>
-      </w:r>
-      <w:r>
-        <w:rPr>
-          <w:b/>
-        </w:rPr>
-        <w:t xml:space="preserve">The governance diagram's detail panel is </w:t>
-      </w:r>
-      <w:r>
-        <w:rPr>
-          <w:rFonts w:ascii="Consolas" w:hAnsi="Consolas"/>
-          <w:b/>
-        </w:rPr>
-        <w:t>clamp(118px, 20vh, 200px)</w:t>
-      </w:r>
-      <w:r>
-        <w:rPr>
-          <w:b/>
-        </w:rPr>
-        <w:t xml:space="preserve"> tall.</w:t>
-      </w:r>
-      <w:r>
-        <w:rPr/>
-        <w:t xml:space="preserve"> The longest framework </w:t>
-      </w:r>
-      <w:r>
-        <w:rPr>
-          <w:rFonts w:ascii="Consolas" w:hAnsi="Consolas"/>
-        </w:rPr>
-        <w:t>Policy_Purpose</w:t>
-      </w:r>
-      <w:r>
-        <w:rPr/>
-        <w:t xml:space="preserve"> now runs to 1,343 characters and scrolls. One CSS line in the </w:t>
-      </w:r>
-      <w:r>
-        <w:rPr>
-          <w:rFonts w:ascii="Consolas" w:hAnsi="Consolas"/>
-        </w:rPr>
-        <w:t>TEMPLATE</w:t>
-      </w:r>
-      <w:r>
-        <w:rPr/>
-        <w:t xml:space="preserve"> string of </w:t>
-      </w:r>
-      <w:r>
-        <w:rPr>
-          <w:rFonts w:ascii="Consolas" w:hAnsi="Consolas"/>
-        </w:rPr>
-        <w:t>build_governance_diagram.py</w:t>
-      </w:r>
-      <w:r>
-        <w:rPr/>
-        <w:t xml:space="preserve"> (not the HTML).</w:t>
-      </w:r>
-    </w:p>
-    <w:p>
-      <w:pPr>
-        <w:tabs>
-          <w:tab w:pos="454" w:val="left"/>
-        </w:tabs>
-        <w:spacing w:after="60"/>
-        <w:ind w:left="454" w:hanging="454"/>
-      </w:pPr>
-      <w:r>
-        <w:rPr/>
-        <w:t>17.</w:t>
         <w:tab/>
       </w:r>
       <w:r>

</xml_diff>

<commit_message>
UK v34: correct LEG-003 Carbon Budget Order link
LEG-003 linked to uksi/2021/1059, which resolves to wsi/2021/1059 (a
revoked Welsh commencement order). Corrected to uksi/2021/750, The Carbon
Budget Order 2021, verified against legislation.gov.uk data.xml. Found by
check_legislation_links.py on its first live run for this record.

- Title cache: verified entries for LEG-003 and LEG-049
- Handover and README: UK v34; LEG-003/049 removed from Open work item 2
- Dashboards and exports rebuilt by finalise.py

Co-Authored-By: Claude Opus 5.5 <noreply@anthropic.com>
Claude-Session: https://claude.ai/code/session_01AXpUr5Jv7F4hv6YdhfHEwx
</commit_message>
<xml_diff>
--- a/Exports/docx/PROJECT_HANDOVER_Nature_Climate_Indicators.docx
+++ b/Exports/docx/PROJECT_HANDOVER_Nature_Climate_Indicators.docx
@@ -25,11 +25,11 @@
         <w:rPr>
           <w:b/>
         </w:rPr>
-        <w:t>Current as of 6 October 2026</w:t>
-      </w:r>
-      <w:r>
-        <w:rPr/>
-        <w:t xml:space="preserve"> (workbooks UK governance v33, international v18, indicators v28). This document describes what exists, where it is and how to use it. It is not a history: settled decisions are not recorded here, only current state and genuinely unresolved work (§9).</w:t>
+        <w:t>Current as of 7 October 2026</w:t>
+      </w:r>
+      <w:r>
+        <w:rPr/>
+        <w:t xml:space="preserve"> (workbooks UK governance v34, international v18, indicators v28). This document describes what exists, where it is and how to use it. It is not a history: settled decisions are not recorded here, only current state and genuinely unresolved work (§9).</w:t>
       </w:r>
     </w:p>
     <w:p>
@@ -814,13 +814,13 @@
                 <w:b/>
                 <w:sz w:val="18"/>
               </w:rPr>
-              <w:t>v33</w:t>
+              <w:t>v34</w:t>
             </w:r>
             <w:r>
               <w:rPr>
                 <w:sz w:val="18"/>
               </w:rPr>
-              <w:t xml:space="preserve"> (2026-10-06)</w:t>
+              <w:t xml:space="preserve"> (2026-10-07)</w:t>
             </w:r>
           </w:p>
         </w:tc>
@@ -6074,7 +6074,7 @@
       </w:r>
       <w:r>
         <w:rPr/>
-        <w:t xml:space="preserve"> row; inbound from [ORG-020], [POL-033], [POL-034], [POL-052], [INT-L-023]). [LEG-003] and [LEG-049] have not yet been title-checked — the link gate will check them on its first run with network access. [LEG-021] links to bills.parliament.uk, which the gate does not read.</w:t>
+        <w:t xml:space="preserve"> row; inbound from [ORG-020], [POL-033], [POL-034], [POL-052], [INT-L-023]). [LEG-021] links to bills.parliament.uk, which the gate does not read.</w:t>
       </w:r>
     </w:p>
     <w:p>

</xml_diff>

<commit_message>
Copilot config notes travel with .github; no comments in README code blocks
- Copilot_setup/README.md replaced by .github/COPILOT_CONFIG_NOTES.md,
  rewritten for post-install use (inventory, handoffs, deliberate
  omissions, untested VS Code names); copied to the root with .github/
- Root README and handover section 6.1 point to the notes
- Root README Getting started and PA_toolkit/README: explanations moved
  out of code blocks so each block copies and runs cleanly

Co-Authored-By: Claude Opus 5.5 <noreply@anthropic.com>
Claude-Session: https://claude.ai/code/session_01AXpUr5Jv7F4hv6YdhfHEwx
</commit_message>
<xml_diff>
--- a/Exports/docx/PROJECT_HANDOVER_Nature_Climate_Indicators.docx
+++ b/Exports/docx/PROJECT_HANDOVER_Nature_Climate_Indicators.docx
@@ -4487,7 +4487,27 @@
       </w:r>
       <w:r>
         <w:rPr/>
-        <w:t>. No model is pinned; it is chosen in the chat model picker.</w:t>
+        <w:t xml:space="preserve">; the configuration's inventory, handoffs, deliberate omissions and untested VS Code names are in </w:t>
+      </w:r>
+      <w:r>
+        <w:rPr>
+          <w:rFonts w:ascii="Consolas" w:hAnsi="Consolas"/>
+        </w:rPr>
+        <w:t>.github/COPILOT_CONFIG_NOTES.md</w:t>
+      </w:r>
+      <w:r>
+        <w:rPr/>
+        <w:t xml:space="preserve">, which travels with </w:t>
+      </w:r>
+      <w:r>
+        <w:rPr>
+          <w:rFonts w:ascii="Consolas" w:hAnsi="Consolas"/>
+        </w:rPr>
+        <w:t>.github/</w:t>
+      </w:r>
+      <w:r>
+        <w:rPr/>
+        <w:t xml:space="preserve"> on installation. No model is pinned; it is chosen in the chat model picker.</w:t>
       </w:r>
     </w:p>
     <w:p>

</xml_diff>